<commit_message>
Add comments, minor fixes
</commit_message>
<xml_diff>
--- a/Courses/Software-Sciences/IT-Module-3-Web-Design/23-Web-Security/23-Web-Security-Exercises.docx
+++ b/Courses/Software-Sciences/IT-Module-3-Web-Design/23-Web-Security/23-Web-Security-Exercises.docx
@@ -1,6 +1,6 @@
 
 <file path=word/document.xml><?xml version="1.0" encoding="utf-8"?>
-<w:document xmlns:wpc="http://schemas.microsoft.com/office/word/2010/wordprocessingCanvas" xmlns:cx="http://schemas.microsoft.com/office/drawing/2014/chartex" xmlns:cx1="http://schemas.microsoft.com/office/drawing/2015/9/8/chartex" xmlns:cx2="http://schemas.microsoft.com/office/drawing/2015/10/21/chartex" xmlns:cx3="http://schemas.microsoft.com/office/drawing/2016/5/9/chartex" xmlns:cx4="http://schemas.microsoft.com/office/drawing/2016/5/10/chartex" xmlns:cx5="http://schemas.microsoft.com/office/drawing/2016/5/11/chartex" xmlns:cx6="http://schemas.microsoft.com/office/drawing/2016/5/12/chartex" xmlns:cx7="http://schemas.microsoft.com/office/drawing/2016/5/13/chartex" xmlns:cx8="http://schemas.microsoft.com/office/drawing/2016/5/14/chartex" xmlns:mc="http://schemas.openxmlformats.org/markup-compatibility/2006" xmlns:aink="http://schemas.microsoft.com/office/drawing/2016/ink" xmlns:am3d="http://schemas.microsoft.com/office/drawing/2017/model3d" xmlns:o="urn:schemas-microsoft-com:office:office" xmlns:oel="http://schemas.microsoft.com/office/2019/extlst" xmlns:r="http://schemas.openxmlformats.org/officeDocument/2006/relationships" xmlns:m="http://schemas.openxmlformats.org/officeDocument/2006/math" xmlns:v="urn:schemas-microsoft-com:vml" xmlns:wp14="http://schemas.microsoft.com/office/word/2010/wordprocessingDrawing" xmlns:wp="http://schemas.openxmlformats.org/drawingml/2006/wordprocessingDrawing" xmlns:w10="urn:schemas-microsoft-com:office:word" xmlns:w="http://schemas.openxmlformats.org/wordprocessingml/2006/main" xmlns:w14="http://schemas.microsoft.com/office/word/2010/wordml" xmlns:w15="http://schemas.microsoft.com/office/word/2012/wordml" xmlns:w16cex="http://schemas.microsoft.com/office/word/2018/wordml/cex" xmlns:w16cid="http://schemas.microsoft.com/office/word/2016/wordml/cid" xmlns:w16="http://schemas.microsoft.com/office/word/2018/wordml" xmlns:w16sdtdh="http://schemas.microsoft.com/office/word/2020/wordml/sdtdatahash" xmlns:w16se="http://schemas.microsoft.com/office/word/2015/wordml/symex" xmlns:wpg="http://schemas.microsoft.com/office/word/2010/wordprocessingGroup" xmlns:wpi="http://schemas.microsoft.com/office/word/2010/wordprocessingInk" xmlns:wne="http://schemas.microsoft.com/office/word/2006/wordml" xmlns:wps="http://schemas.microsoft.com/office/word/2010/wordprocessingShape" mc:Ignorable="w14 w15 w16se w16cid w16 w16cex w16sdtdh wp14">
+<w:document xmlns:wpc="http://schemas.microsoft.com/office/word/2010/wordprocessingCanvas" xmlns:cx="http://schemas.microsoft.com/office/drawing/2014/chartex" xmlns:cx1="http://schemas.microsoft.com/office/drawing/2015/9/8/chartex" xmlns:cx2="http://schemas.microsoft.com/office/drawing/2015/10/21/chartex" xmlns:cx3="http://schemas.microsoft.com/office/drawing/2016/5/9/chartex" xmlns:cx4="http://schemas.microsoft.com/office/drawing/2016/5/10/chartex" xmlns:cx5="http://schemas.microsoft.com/office/drawing/2016/5/11/chartex" xmlns:cx6="http://schemas.microsoft.com/office/drawing/2016/5/12/chartex" xmlns:cx7="http://schemas.microsoft.com/office/drawing/2016/5/13/chartex" xmlns:cx8="http://schemas.microsoft.com/office/drawing/2016/5/14/chartex" xmlns:mc="http://schemas.openxmlformats.org/markup-compatibility/2006" xmlns:aink="http://schemas.microsoft.com/office/drawing/2016/ink" xmlns:am3d="http://schemas.microsoft.com/office/drawing/2017/model3d" xmlns:o="urn:schemas-microsoft-com:office:office" xmlns:oel="http://schemas.microsoft.com/office/2019/extlst" xmlns:r="http://schemas.openxmlformats.org/officeDocument/2006/relationships" xmlns:m="http://schemas.openxmlformats.org/officeDocument/2006/math" xmlns:v="urn:schemas-microsoft-com:vml" xmlns:wp14="http://schemas.microsoft.com/office/word/2010/wordprocessingDrawing" xmlns:wp="http://schemas.openxmlformats.org/drawingml/2006/wordprocessingDrawing" xmlns:w10="urn:schemas-microsoft-com:office:word" xmlns:w="http://schemas.openxmlformats.org/wordprocessingml/2006/main" xmlns:w14="http://schemas.microsoft.com/office/word/2010/wordml" xmlns:w15="http://schemas.microsoft.com/office/word/2012/wordml" xmlns:w16cex="http://schemas.microsoft.com/office/word/2018/wordml/cex" xmlns:w16cid="http://schemas.microsoft.com/office/word/2016/wordml/cid" xmlns:w16="http://schemas.microsoft.com/office/word/2018/wordml" xmlns:w16du="http://schemas.microsoft.com/office/word/2023/wordml/word16du" xmlns:w16sdtdh="http://schemas.microsoft.com/office/word/2020/wordml/sdtdatahash" xmlns:w16se="http://schemas.microsoft.com/office/word/2015/wordml/symex" xmlns:wpg="http://schemas.microsoft.com/office/word/2010/wordprocessingGroup" xmlns:wpi="http://schemas.microsoft.com/office/word/2010/wordprocessingInk" xmlns:wne="http://schemas.microsoft.com/office/word/2006/wordml" xmlns:wps="http://schemas.microsoft.com/office/word/2010/wordprocessingShape" mc:Ignorable="w14 w15 w16se w16cid w16 w16cex w16sdtdh w16du wp14">
   <w:body>
     <w:p>
       <w:pPr>
@@ -87,7 +87,7 @@
           <w:noProof/>
         </w:rPr>
         <w:drawing>
-          <wp:inline distT="0" distB="0" distL="0" distR="0" wp14:anchorId="73F5C6D6" wp14:editId="00915E82">
+          <wp:inline distT="0" distB="0" distL="0" distR="0" wp14:anchorId="73F5C6D6" wp14:editId="395769CA">
             <wp:extent cx="1065886" cy="497260"/>
             <wp:effectExtent l="0" t="0" r="1270" b="0"/>
             <wp:docPr id="470543985" name="Picture 1"/>
@@ -753,7 +753,7 @@
           <w:lang w:val="bg-BG"/>
         </w:rPr>
         <w:drawing>
-          <wp:inline distT="0" distB="0" distL="0" distR="0" wp14:anchorId="6C75137E" wp14:editId="4E2BC780">
+          <wp:inline distT="0" distB="0" distL="0" distR="0" wp14:anchorId="6C75137E" wp14:editId="7B02E6A6">
             <wp:extent cx="2682964" cy="1298209"/>
             <wp:effectExtent l="12700" t="12700" r="9525" b="10160"/>
             <wp:docPr id="632321972" name="Picture 1"/>
@@ -974,7 +974,7 @@
           <w:lang w:val="bg-BG"/>
         </w:rPr>
         <w:drawing>
-          <wp:inline distT="0" distB="0" distL="0" distR="0" wp14:anchorId="2767F768" wp14:editId="3C922896">
+          <wp:inline distT="0" distB="0" distL="0" distR="0" wp14:anchorId="2767F768" wp14:editId="43E31E01">
             <wp:extent cx="3353587" cy="3449204"/>
             <wp:effectExtent l="12700" t="12700" r="12065" b="18415"/>
             <wp:docPr id="1646181426" name="Picture 2"/>
@@ -989,7 +989,7 @@
                     <pic:cNvPicPr/>
                   </pic:nvPicPr>
                   <pic:blipFill>
-                    <a:blip r:embed="rId10" cstate="print">
+                    <a:blip r:embed="rId11" cstate="print">
                       <a:extLst>
                         <a:ext uri="{28A0092B-C50C-407E-A947-70E740481C1C}">
                           <a14:useLocalDpi xmlns:a14="http://schemas.microsoft.com/office/drawing/2010/main" val="0"/>
@@ -1088,7 +1088,13 @@
           <w:bCs/>
           <w:lang w:val="bg-BG"/>
         </w:rPr>
-        <w:t xml:space="preserve">уеб </w:t>
+        <w:t>уеб сайта</w:t>
+      </w:r>
+      <w:r>
+        <w:rPr>
+          <w:lang w:val="bg-BG"/>
+        </w:rPr>
+        <w:t xml:space="preserve"> и </w:t>
       </w:r>
       <w:r>
         <w:rPr>
@@ -1096,20 +1102,6 @@
           <w:bCs/>
           <w:lang w:val="bg-BG"/>
         </w:rPr>
-        <w:t>сайта</w:t>
-      </w:r>
-      <w:r>
-        <w:rPr>
-          <w:lang w:val="bg-BG"/>
-        </w:rPr>
-        <w:t xml:space="preserve"> и </w:t>
-      </w:r>
-      <w:r>
-        <w:rPr>
-          <w:b/>
-          <w:bCs/>
-          <w:lang w:val="bg-BG"/>
-        </w:rPr>
         <w:t>датата</w:t>
       </w:r>
       <w:r>
@@ -1120,6 +1112,11 @@
       </w:r>
     </w:p>
     <w:p>
+      <w:pPr>
+        <w:rPr>
+          <w:lang w:val="bg-BG"/>
+        </w:rPr>
+      </w:pPr>
       <w:r>
         <w:rPr>
           <w:noProof/>
@@ -1140,7 +1137,7 @@
                     <pic:cNvPicPr/>
                   </pic:nvPicPr>
                   <pic:blipFill>
-                    <a:blip r:embed="rId11">
+                    <a:blip r:embed="rId12">
                       <a:extLst>
                         <a:ext uri="{28A0092B-C50C-407E-A947-70E740481C1C}">
                           <a14:useLocalDpi xmlns:a14="http://schemas.microsoft.com/office/drawing/2010/main" val="0"/>
@@ -1174,9 +1171,34 @@
         </w:drawing>
       </w:r>
     </w:p>
+    <w:p>
+      <w:pPr>
+        <w:rPr>
+          <w:lang w:val="bg-BG"/>
+        </w:rPr>
+      </w:pPr>
+    </w:p>
+    <w:p>
+      <w:pPr>
+        <w:rPr>
+          <w:sz w:val="40"/>
+          <w:szCs w:val="40"/>
+          <w:lang w:val="bg-BG"/>
+        </w:rPr>
+      </w:pPr>
+      <w:r>
+        <w:rPr>
+          <w:sz w:val="40"/>
+          <w:szCs w:val="40"/>
+          <w:highlight w:val="yellow"/>
+          <w:lang w:val="bg-BG"/>
+        </w:rPr>
+        <w:t>Да се добави задача за възтановяване на уебсайта от бекъп</w:t>
+      </w:r>
+    </w:p>
     <w:sectPr>
-      <w:headerReference w:type="default" r:id="rId12"/>
-      <w:footerReference w:type="default" r:id="rId13"/>
+      <w:headerReference w:type="default" r:id="rId13"/>
+      <w:footerReference w:type="default" r:id="rId14"/>
       <w:pgSz w:w="11909" w:h="16834" w:code="9"/>
       <w:pgMar w:top="567" w:right="737" w:bottom="680" w:left="737" w:header="567" w:footer="510" w:gutter="0"/>
       <w:cols w:space="720"/>
@@ -1187,7 +1209,7 @@
 </file>
 
 <file path=word/endnotes.xml><?xml version="1.0" encoding="utf-8"?>
-<w:endnotes xmlns:wpc="http://schemas.microsoft.com/office/word/2010/wordprocessingCanvas" xmlns:cx="http://schemas.microsoft.com/office/drawing/2014/chartex" xmlns:cx1="http://schemas.microsoft.com/office/drawing/2015/9/8/chartex" xmlns:cx2="http://schemas.microsoft.com/office/drawing/2015/10/21/chartex" xmlns:cx3="http://schemas.microsoft.com/office/drawing/2016/5/9/chartex" xmlns:cx4="http://schemas.microsoft.com/office/drawing/2016/5/10/chartex" xmlns:cx5="http://schemas.microsoft.com/office/drawing/2016/5/11/chartex" xmlns:cx6="http://schemas.microsoft.com/office/drawing/2016/5/12/chartex" xmlns:cx7="http://schemas.microsoft.com/office/drawing/2016/5/13/chartex" xmlns:cx8="http://schemas.microsoft.com/office/drawing/2016/5/14/chartex" xmlns:mc="http://schemas.openxmlformats.org/markup-compatibility/2006" xmlns:aink="http://schemas.microsoft.com/office/drawing/2016/ink" xmlns:am3d="http://schemas.microsoft.com/office/drawing/2017/model3d" xmlns:o="urn:schemas-microsoft-com:office:office" xmlns:oel="http://schemas.microsoft.com/office/2019/extlst" xmlns:r="http://schemas.openxmlformats.org/officeDocument/2006/relationships" xmlns:m="http://schemas.openxmlformats.org/officeDocument/2006/math" xmlns:v="urn:schemas-microsoft-com:vml" xmlns:wp14="http://schemas.microsoft.com/office/word/2010/wordprocessingDrawing" xmlns:wp="http://schemas.openxmlformats.org/drawingml/2006/wordprocessingDrawing" xmlns:w10="urn:schemas-microsoft-com:office:word" xmlns:w="http://schemas.openxmlformats.org/wordprocessingml/2006/main" xmlns:w14="http://schemas.microsoft.com/office/word/2010/wordml" xmlns:w15="http://schemas.microsoft.com/office/word/2012/wordml" xmlns:w16cex="http://schemas.microsoft.com/office/word/2018/wordml/cex" xmlns:w16cid="http://schemas.microsoft.com/office/word/2016/wordml/cid" xmlns:w16="http://schemas.microsoft.com/office/word/2018/wordml" xmlns:w16sdtdh="http://schemas.microsoft.com/office/word/2020/wordml/sdtdatahash" xmlns:w16se="http://schemas.microsoft.com/office/word/2015/wordml/symex" xmlns:wpg="http://schemas.microsoft.com/office/word/2010/wordprocessingGroup" xmlns:wpi="http://schemas.microsoft.com/office/word/2010/wordprocessingInk" xmlns:wne="http://schemas.microsoft.com/office/word/2006/wordml" xmlns:wps="http://schemas.microsoft.com/office/word/2010/wordprocessingShape" mc:Ignorable="w14 w15 w16se w16cid w16 w16cex w16sdtdh wp14">
+<w:endnotes xmlns:wpc="http://schemas.microsoft.com/office/word/2010/wordprocessingCanvas" xmlns:cx="http://schemas.microsoft.com/office/drawing/2014/chartex" xmlns:cx1="http://schemas.microsoft.com/office/drawing/2015/9/8/chartex" xmlns:cx2="http://schemas.microsoft.com/office/drawing/2015/10/21/chartex" xmlns:cx3="http://schemas.microsoft.com/office/drawing/2016/5/9/chartex" xmlns:cx4="http://schemas.microsoft.com/office/drawing/2016/5/10/chartex" xmlns:cx5="http://schemas.microsoft.com/office/drawing/2016/5/11/chartex" xmlns:cx6="http://schemas.microsoft.com/office/drawing/2016/5/12/chartex" xmlns:cx7="http://schemas.microsoft.com/office/drawing/2016/5/13/chartex" xmlns:cx8="http://schemas.microsoft.com/office/drawing/2016/5/14/chartex" xmlns:mc="http://schemas.openxmlformats.org/markup-compatibility/2006" xmlns:aink="http://schemas.microsoft.com/office/drawing/2016/ink" xmlns:am3d="http://schemas.microsoft.com/office/drawing/2017/model3d" xmlns:o="urn:schemas-microsoft-com:office:office" xmlns:oel="http://schemas.microsoft.com/office/2019/extlst" xmlns:r="http://schemas.openxmlformats.org/officeDocument/2006/relationships" xmlns:m="http://schemas.openxmlformats.org/officeDocument/2006/math" xmlns:v="urn:schemas-microsoft-com:vml" xmlns:wp14="http://schemas.microsoft.com/office/word/2010/wordprocessingDrawing" xmlns:wp="http://schemas.openxmlformats.org/drawingml/2006/wordprocessingDrawing" xmlns:w10="urn:schemas-microsoft-com:office:word" xmlns:w="http://schemas.openxmlformats.org/wordprocessingml/2006/main" xmlns:w14="http://schemas.microsoft.com/office/word/2010/wordml" xmlns:w15="http://schemas.microsoft.com/office/word/2012/wordml" xmlns:w16cex="http://schemas.microsoft.com/office/word/2018/wordml/cex" xmlns:w16cid="http://schemas.microsoft.com/office/word/2016/wordml/cid" xmlns:w16="http://schemas.microsoft.com/office/word/2018/wordml" xmlns:w16du="http://schemas.microsoft.com/office/word/2023/wordml/word16du" xmlns:w16sdtdh="http://schemas.microsoft.com/office/word/2020/wordml/sdtdatahash" xmlns:w16se="http://schemas.microsoft.com/office/word/2015/wordml/symex" xmlns:wpg="http://schemas.microsoft.com/office/word/2010/wordprocessingGroup" xmlns:wpi="http://schemas.microsoft.com/office/word/2010/wordprocessingInk" xmlns:wne="http://schemas.microsoft.com/office/word/2006/wordml" xmlns:wps="http://schemas.microsoft.com/office/word/2010/wordprocessingShape" mc:Ignorable="w14 w15 w16se w16cid w16 w16cex w16sdtdh w16du wp14">
   <w:endnote w:type="separator" w:id="-1">
     <w:p>
       <w:pPr>
@@ -1212,7 +1234,7 @@
 </file>
 
 <file path=word/footer1.xml><?xml version="1.0" encoding="utf-8"?>
-<w:ftr xmlns:wpc="http://schemas.microsoft.com/office/word/2010/wordprocessingCanvas" xmlns:cx="http://schemas.microsoft.com/office/drawing/2014/chartex" xmlns:cx1="http://schemas.microsoft.com/office/drawing/2015/9/8/chartex" xmlns:cx2="http://schemas.microsoft.com/office/drawing/2015/10/21/chartex" xmlns:cx3="http://schemas.microsoft.com/office/drawing/2016/5/9/chartex" xmlns:cx4="http://schemas.microsoft.com/office/drawing/2016/5/10/chartex" xmlns:cx5="http://schemas.microsoft.com/office/drawing/2016/5/11/chartex" xmlns:cx6="http://schemas.microsoft.com/office/drawing/2016/5/12/chartex" xmlns:cx7="http://schemas.microsoft.com/office/drawing/2016/5/13/chartex" xmlns:cx8="http://schemas.microsoft.com/office/drawing/2016/5/14/chartex" xmlns:mc="http://schemas.openxmlformats.org/markup-compatibility/2006" xmlns:aink="http://schemas.microsoft.com/office/drawing/2016/ink" xmlns:am3d="http://schemas.microsoft.com/office/drawing/2017/model3d" xmlns:o="urn:schemas-microsoft-com:office:office" xmlns:oel="http://schemas.microsoft.com/office/2019/extlst" xmlns:r="http://schemas.openxmlformats.org/officeDocument/2006/relationships" xmlns:m="http://schemas.openxmlformats.org/officeDocument/2006/math" xmlns:v="urn:schemas-microsoft-com:vml" xmlns:wp14="http://schemas.microsoft.com/office/word/2010/wordprocessingDrawing" xmlns:wp="http://schemas.openxmlformats.org/drawingml/2006/wordprocessingDrawing" xmlns:w10="urn:schemas-microsoft-com:office:word" xmlns:w="http://schemas.openxmlformats.org/wordprocessingml/2006/main" xmlns:w14="http://schemas.microsoft.com/office/word/2010/wordml" xmlns:w15="http://schemas.microsoft.com/office/word/2012/wordml" xmlns:w16cex="http://schemas.microsoft.com/office/word/2018/wordml/cex" xmlns:w16cid="http://schemas.microsoft.com/office/word/2016/wordml/cid" xmlns:w16="http://schemas.microsoft.com/office/word/2018/wordml" xmlns:w16sdtdh="http://schemas.microsoft.com/office/word/2020/wordml/sdtdatahash" xmlns:w16se="http://schemas.microsoft.com/office/word/2015/wordml/symex" xmlns:wpg="http://schemas.microsoft.com/office/word/2010/wordprocessingGroup" xmlns:wpi="http://schemas.microsoft.com/office/word/2010/wordprocessingInk" xmlns:wne="http://schemas.microsoft.com/office/word/2006/wordml" xmlns:wps="http://schemas.microsoft.com/office/word/2010/wordprocessingShape" mc:Ignorable="w14 w15 w16se w16cid w16 w16cex w16sdtdh wp14">
+<w:ftr xmlns:wpc="http://schemas.microsoft.com/office/word/2010/wordprocessingCanvas" xmlns:cx="http://schemas.microsoft.com/office/drawing/2014/chartex" xmlns:cx1="http://schemas.microsoft.com/office/drawing/2015/9/8/chartex" xmlns:cx2="http://schemas.microsoft.com/office/drawing/2015/10/21/chartex" xmlns:cx3="http://schemas.microsoft.com/office/drawing/2016/5/9/chartex" xmlns:cx4="http://schemas.microsoft.com/office/drawing/2016/5/10/chartex" xmlns:cx5="http://schemas.microsoft.com/office/drawing/2016/5/11/chartex" xmlns:cx6="http://schemas.microsoft.com/office/drawing/2016/5/12/chartex" xmlns:cx7="http://schemas.microsoft.com/office/drawing/2016/5/13/chartex" xmlns:cx8="http://schemas.microsoft.com/office/drawing/2016/5/14/chartex" xmlns:mc="http://schemas.openxmlformats.org/markup-compatibility/2006" xmlns:aink="http://schemas.microsoft.com/office/drawing/2016/ink" xmlns:am3d="http://schemas.microsoft.com/office/drawing/2017/model3d" xmlns:o="urn:schemas-microsoft-com:office:office" xmlns:oel="http://schemas.microsoft.com/office/2019/extlst" xmlns:r="http://schemas.openxmlformats.org/officeDocument/2006/relationships" xmlns:m="http://schemas.openxmlformats.org/officeDocument/2006/math" xmlns:v="urn:schemas-microsoft-com:vml" xmlns:wp14="http://schemas.microsoft.com/office/word/2010/wordprocessingDrawing" xmlns:wp="http://schemas.openxmlformats.org/drawingml/2006/wordprocessingDrawing" xmlns:w10="urn:schemas-microsoft-com:office:word" xmlns:w="http://schemas.openxmlformats.org/wordprocessingml/2006/main" xmlns:w14="http://schemas.microsoft.com/office/word/2010/wordml" xmlns:w15="http://schemas.microsoft.com/office/word/2012/wordml" xmlns:w16cex="http://schemas.microsoft.com/office/word/2018/wordml/cex" xmlns:w16cid="http://schemas.microsoft.com/office/word/2016/wordml/cid" xmlns:w16="http://schemas.microsoft.com/office/word/2018/wordml" xmlns:w16du="http://schemas.microsoft.com/office/word/2023/wordml/word16du" xmlns:w16sdtdh="http://schemas.microsoft.com/office/word/2020/wordml/sdtdatahash" xmlns:w16se="http://schemas.microsoft.com/office/word/2015/wordml/symex" xmlns:wpg="http://schemas.microsoft.com/office/word/2010/wordprocessingGroup" xmlns:wpi="http://schemas.microsoft.com/office/word/2010/wordprocessingInk" xmlns:wne="http://schemas.microsoft.com/office/word/2006/wordml" xmlns:wps="http://schemas.microsoft.com/office/word/2010/wordprocessingShape" mc:Ignorable="w14 w15 w16se w16cid w16 w16cex w16sdtdh w16du wp14">
   <w:p>
     <w:pPr>
       <w:pStyle w:val="Footer"/>
@@ -1554,13 +1576,13 @@
             </wp:anchor>
           </w:drawing>
         </mc:Choice>
-        <mc:Fallback xmlns="">
+        <mc:Fallback>
           <w:pict>
             <v:shapetype w14:anchorId="7ACB1FAE" id="_x0000_t202" coordsize="21600,21600" o:spt="202" path="m,l,21600r21600,l21600,xe">
               <v:stroke joinstyle="miter"/>
               <v:path gradientshapeok="t" o:connecttype="rect"/>
             </v:shapetype>
-            <v:shape id="Text Box 16" o:spid="_x0000_s1026" type="#_x0000_t202" style="position:absolute;margin-left:101.15pt;margin-top:6.95pt;width:418.95pt;height:40.45pt;z-index:251660288;visibility:visible;mso-wrap-style:square;mso-width-percent:0;mso-height-percent:0;mso-wrap-distance-left:9pt;mso-wrap-distance-top:0;mso-wrap-distance-right:9pt;mso-wrap-distance-bottom:0;mso-position-horizontal:absolute;mso-position-horizontal-relative:text;mso-position-vertical:absolute;mso-position-vertical-relative:text;mso-width-percent:0;mso-height-percent:0;mso-width-relative:page;mso-height-relative:page;v-text-anchor:top" o:gfxdata="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" filled="f" stroked="f">
+            <v:shape id="Text Box 16" o:spid="_x0000_s1026" type="#_x0000_t202" style="position:absolute;margin-left:101.15pt;margin-top:6.95pt;width:418.95pt;height:40.45pt;z-index:251660288;visibility:visible;mso-wrap-style:square;mso-width-percent:0;mso-height-percent:0;mso-wrap-distance-left:9pt;mso-wrap-distance-top:0;mso-wrap-distance-right:9pt;mso-wrap-distance-bottom:0;mso-position-horizontal:absolute;mso-position-horizontal-relative:text;mso-position-vertical:absolute;mso-position-vertical-relative:text;mso-width-percent:0;mso-height-percent:0;mso-width-relative:page;mso-height-relative:page;v-text-anchor:top" o:gfxdata="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" filled="f" stroked="f">
               <v:textbox inset=".5mm,1.2mm,.5mm,.5mm">
                 <w:txbxContent>
                   <w:p>
@@ -1977,7 +1999,7 @@
             </wp:anchor>
           </w:drawing>
         </mc:Choice>
-        <mc:Fallback xmlns:w16du="http://schemas.microsoft.com/office/word/2023/wordml/word16du" xmlns="">
+        <mc:Fallback>
           <w:pict>
             <v:line w14:anchorId="23DA4A24" id="Straight Connector 19" o:spid="_x0000_s1026" style="position:absolute;flip:y;z-index:251659264;visibility:visible;mso-wrap-style:square;mso-width-percent:0;mso-height-percent:0;mso-wrap-distance-left:9pt;mso-wrap-distance-top:0;mso-wrap-distance-right:9pt;mso-wrap-distance-bottom:0;mso-position-horizontal:absolute;mso-position-horizontal-relative:text;mso-position-vertical:absolute;mso-position-vertical-relative:text;mso-width-percent:0;mso-height-percent:0;mso-width-relative:page;mso-height-relative:page" from="-.1pt,5.2pt" to="520.7pt,5.2pt" o:gfxdata="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" strokecolor="#974706 [1609]" strokeweight="1pt">
               <v:stroke endcap="round"/>
@@ -2200,9 +2222,9 @@
             </wp:anchor>
           </w:drawing>
         </mc:Choice>
-        <mc:Fallback xmlns="">
+        <mc:Fallback>
           <w:pict>
-            <v:shape w14:anchorId="0D7D8A2E" id="Text Box 4" o:spid="_x0000_s1027" type="#_x0000_t202" style="position:absolute;margin-left:444.65pt;margin-top:8.35pt;width:70.9pt;height:15.9pt;z-index:251661312;visibility:visible;mso-wrap-style:square;mso-width-percent:0;mso-height-percent:0;mso-wrap-distance-left:9pt;mso-wrap-distance-top:0;mso-wrap-distance-right:9pt;mso-wrap-distance-bottom:0;mso-position-horizontal:absolute;mso-position-horizontal-relative:text;mso-position-vertical:absolute;mso-position-vertical-relative:text;mso-width-percent:0;mso-height-percent:0;mso-width-relative:page;mso-height-relative:page;v-text-anchor:middle" o:gfxdata="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" filled="f" stroked="f" strokeweight=".5pt">
+            <v:shape w14:anchorId="0D7D8A2E" id="Text Box 4" o:spid="_x0000_s1027" type="#_x0000_t202" style="position:absolute;margin-left:444.65pt;margin-top:8.35pt;width:70.9pt;height:15.9pt;z-index:251661312;visibility:visible;mso-wrap-style:square;mso-width-percent:0;mso-height-percent:0;mso-wrap-distance-left:9pt;mso-wrap-distance-top:0;mso-wrap-distance-right:9pt;mso-wrap-distance-bottom:0;mso-position-horizontal:absolute;mso-position-horizontal-relative:text;mso-position-vertical:absolute;mso-position-vertical-relative:text;mso-width-percent:0;mso-height-percent:0;mso-width-relative:page;mso-height-relative:page;v-text-anchor:middle" o:gfxdata="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" filled="f" stroked="f" strokeweight=".5pt">
               <v:textbox inset="0,0,0,0">
                 <w:txbxContent>
                   <w:p>
@@ -2352,7 +2374,7 @@
 </file>
 
 <file path=word/footnotes.xml><?xml version="1.0" encoding="utf-8"?>
-<w:footnotes xmlns:wpc="http://schemas.microsoft.com/office/word/2010/wordprocessingCanvas" xmlns:cx="http://schemas.microsoft.com/office/drawing/2014/chartex" xmlns:cx1="http://schemas.microsoft.com/office/drawing/2015/9/8/chartex" xmlns:cx2="http://schemas.microsoft.com/office/drawing/2015/10/21/chartex" xmlns:cx3="http://schemas.microsoft.com/office/drawing/2016/5/9/chartex" xmlns:cx4="http://schemas.microsoft.com/office/drawing/2016/5/10/chartex" xmlns:cx5="http://schemas.microsoft.com/office/drawing/2016/5/11/chartex" xmlns:cx6="http://schemas.microsoft.com/office/drawing/2016/5/12/chartex" xmlns:cx7="http://schemas.microsoft.com/office/drawing/2016/5/13/chartex" xmlns:cx8="http://schemas.microsoft.com/office/drawing/2016/5/14/chartex" xmlns:mc="http://schemas.openxmlformats.org/markup-compatibility/2006" xmlns:aink="http://schemas.microsoft.com/office/drawing/2016/ink" xmlns:am3d="http://schemas.microsoft.com/office/drawing/2017/model3d" xmlns:o="urn:schemas-microsoft-com:office:office" xmlns:oel="http://schemas.microsoft.com/office/2019/extlst" xmlns:r="http://schemas.openxmlformats.org/officeDocument/2006/relationships" xmlns:m="http://schemas.openxmlformats.org/officeDocument/2006/math" xmlns:v="urn:schemas-microsoft-com:vml" xmlns:wp14="http://schemas.microsoft.com/office/word/2010/wordprocessingDrawing" xmlns:wp="http://schemas.openxmlformats.org/drawingml/2006/wordprocessingDrawing" xmlns:w10="urn:schemas-microsoft-com:office:word" xmlns:w="http://schemas.openxmlformats.org/wordprocessingml/2006/main" xmlns:w14="http://schemas.microsoft.com/office/word/2010/wordml" xmlns:w15="http://schemas.microsoft.com/office/word/2012/wordml" xmlns:w16cex="http://schemas.microsoft.com/office/word/2018/wordml/cex" xmlns:w16cid="http://schemas.microsoft.com/office/word/2016/wordml/cid" xmlns:w16="http://schemas.microsoft.com/office/word/2018/wordml" xmlns:w16sdtdh="http://schemas.microsoft.com/office/word/2020/wordml/sdtdatahash" xmlns:w16se="http://schemas.microsoft.com/office/word/2015/wordml/symex" xmlns:wpg="http://schemas.microsoft.com/office/word/2010/wordprocessingGroup" xmlns:wpi="http://schemas.microsoft.com/office/word/2010/wordprocessingInk" xmlns:wne="http://schemas.microsoft.com/office/word/2006/wordml" xmlns:wps="http://schemas.microsoft.com/office/word/2010/wordprocessingShape" mc:Ignorable="w14 w15 w16se w16cid w16 w16cex w16sdtdh wp14">
+<w:footnotes xmlns:wpc="http://schemas.microsoft.com/office/word/2010/wordprocessingCanvas" xmlns:cx="http://schemas.microsoft.com/office/drawing/2014/chartex" xmlns:cx1="http://schemas.microsoft.com/office/drawing/2015/9/8/chartex" xmlns:cx2="http://schemas.microsoft.com/office/drawing/2015/10/21/chartex" xmlns:cx3="http://schemas.microsoft.com/office/drawing/2016/5/9/chartex" xmlns:cx4="http://schemas.microsoft.com/office/drawing/2016/5/10/chartex" xmlns:cx5="http://schemas.microsoft.com/office/drawing/2016/5/11/chartex" xmlns:cx6="http://schemas.microsoft.com/office/drawing/2016/5/12/chartex" xmlns:cx7="http://schemas.microsoft.com/office/drawing/2016/5/13/chartex" xmlns:cx8="http://schemas.microsoft.com/office/drawing/2016/5/14/chartex" xmlns:mc="http://schemas.openxmlformats.org/markup-compatibility/2006" xmlns:aink="http://schemas.microsoft.com/office/drawing/2016/ink" xmlns:am3d="http://schemas.microsoft.com/office/drawing/2017/model3d" xmlns:o="urn:schemas-microsoft-com:office:office" xmlns:oel="http://schemas.microsoft.com/office/2019/extlst" xmlns:r="http://schemas.openxmlformats.org/officeDocument/2006/relationships" xmlns:m="http://schemas.openxmlformats.org/officeDocument/2006/math" xmlns:v="urn:schemas-microsoft-com:vml" xmlns:wp14="http://schemas.microsoft.com/office/word/2010/wordprocessingDrawing" xmlns:wp="http://schemas.openxmlformats.org/drawingml/2006/wordprocessingDrawing" xmlns:w10="urn:schemas-microsoft-com:office:word" xmlns:w="http://schemas.openxmlformats.org/wordprocessingml/2006/main" xmlns:w14="http://schemas.microsoft.com/office/word/2010/wordml" xmlns:w15="http://schemas.microsoft.com/office/word/2012/wordml" xmlns:w16cex="http://schemas.microsoft.com/office/word/2018/wordml/cex" xmlns:w16cid="http://schemas.microsoft.com/office/word/2016/wordml/cid" xmlns:w16="http://schemas.microsoft.com/office/word/2018/wordml" xmlns:w16du="http://schemas.microsoft.com/office/word/2023/wordml/word16du" xmlns:w16sdtdh="http://schemas.microsoft.com/office/word/2020/wordml/sdtdatahash" xmlns:w16se="http://schemas.microsoft.com/office/word/2015/wordml/symex" xmlns:wpg="http://schemas.microsoft.com/office/word/2010/wordprocessingGroup" xmlns:wpi="http://schemas.microsoft.com/office/word/2010/wordprocessingInk" xmlns:wne="http://schemas.microsoft.com/office/word/2006/wordml" xmlns:wps="http://schemas.microsoft.com/office/word/2010/wordprocessingShape" mc:Ignorable="w14 w15 w16se w16cid w16 w16cex w16sdtdh w16du wp14">
   <w:footnote w:type="separator" w:id="-1">
     <w:p>
       <w:pPr>
@@ -2377,7 +2399,7 @@
 </file>
 
 <file path=word/header1.xml><?xml version="1.0" encoding="utf-8"?>
-<w:hdr xmlns:wpc="http://schemas.microsoft.com/office/word/2010/wordprocessingCanvas" xmlns:cx="http://schemas.microsoft.com/office/drawing/2014/chartex" xmlns:cx1="http://schemas.microsoft.com/office/drawing/2015/9/8/chartex" xmlns:cx2="http://schemas.microsoft.com/office/drawing/2015/10/21/chartex" xmlns:cx3="http://schemas.microsoft.com/office/drawing/2016/5/9/chartex" xmlns:cx4="http://schemas.microsoft.com/office/drawing/2016/5/10/chartex" xmlns:cx5="http://schemas.microsoft.com/office/drawing/2016/5/11/chartex" xmlns:cx6="http://schemas.microsoft.com/office/drawing/2016/5/12/chartex" xmlns:cx7="http://schemas.microsoft.com/office/drawing/2016/5/13/chartex" xmlns:cx8="http://schemas.microsoft.com/office/drawing/2016/5/14/chartex" xmlns:mc="http://schemas.openxmlformats.org/markup-compatibility/2006" xmlns:aink="http://schemas.microsoft.com/office/drawing/2016/ink" xmlns:am3d="http://schemas.microsoft.com/office/drawing/2017/model3d" xmlns:o="urn:schemas-microsoft-com:office:office" xmlns:oel="http://schemas.microsoft.com/office/2019/extlst" xmlns:r="http://schemas.openxmlformats.org/officeDocument/2006/relationships" xmlns:m="http://schemas.openxmlformats.org/officeDocument/2006/math" xmlns:v="urn:schemas-microsoft-com:vml" xmlns:wp14="http://schemas.microsoft.com/office/word/2010/wordprocessingDrawing" xmlns:wp="http://schemas.openxmlformats.org/drawingml/2006/wordprocessingDrawing" xmlns:w10="urn:schemas-microsoft-com:office:word" xmlns:w="http://schemas.openxmlformats.org/wordprocessingml/2006/main" xmlns:w14="http://schemas.microsoft.com/office/word/2010/wordml" xmlns:w15="http://schemas.microsoft.com/office/word/2012/wordml" xmlns:w16cex="http://schemas.microsoft.com/office/word/2018/wordml/cex" xmlns:w16cid="http://schemas.microsoft.com/office/word/2016/wordml/cid" xmlns:w16="http://schemas.microsoft.com/office/word/2018/wordml" xmlns:w16sdtdh="http://schemas.microsoft.com/office/word/2020/wordml/sdtdatahash" xmlns:w16se="http://schemas.microsoft.com/office/word/2015/wordml/symex" xmlns:wpg="http://schemas.microsoft.com/office/word/2010/wordprocessingGroup" xmlns:wpi="http://schemas.microsoft.com/office/word/2010/wordprocessingInk" xmlns:wne="http://schemas.microsoft.com/office/word/2006/wordml" xmlns:wps="http://schemas.microsoft.com/office/word/2010/wordprocessingShape" mc:Ignorable="w14 w15 w16se w16cid w16 w16cex w16sdtdh wp14">
+<w:hdr xmlns:wpc="http://schemas.microsoft.com/office/word/2010/wordprocessingCanvas" xmlns:cx="http://schemas.microsoft.com/office/drawing/2014/chartex" xmlns:cx1="http://schemas.microsoft.com/office/drawing/2015/9/8/chartex" xmlns:cx2="http://schemas.microsoft.com/office/drawing/2015/10/21/chartex" xmlns:cx3="http://schemas.microsoft.com/office/drawing/2016/5/9/chartex" xmlns:cx4="http://schemas.microsoft.com/office/drawing/2016/5/10/chartex" xmlns:cx5="http://schemas.microsoft.com/office/drawing/2016/5/11/chartex" xmlns:cx6="http://schemas.microsoft.com/office/drawing/2016/5/12/chartex" xmlns:cx7="http://schemas.microsoft.com/office/drawing/2016/5/13/chartex" xmlns:cx8="http://schemas.microsoft.com/office/drawing/2016/5/14/chartex" xmlns:mc="http://schemas.openxmlformats.org/markup-compatibility/2006" xmlns:aink="http://schemas.microsoft.com/office/drawing/2016/ink" xmlns:am3d="http://schemas.microsoft.com/office/drawing/2017/model3d" xmlns:o="urn:schemas-microsoft-com:office:office" xmlns:oel="http://schemas.microsoft.com/office/2019/extlst" xmlns:r="http://schemas.openxmlformats.org/officeDocument/2006/relationships" xmlns:m="http://schemas.openxmlformats.org/officeDocument/2006/math" xmlns:v="urn:schemas-microsoft-com:vml" xmlns:wp14="http://schemas.microsoft.com/office/word/2010/wordprocessingDrawing" xmlns:wp="http://schemas.openxmlformats.org/drawingml/2006/wordprocessingDrawing" xmlns:w10="urn:schemas-microsoft-com:office:word" xmlns:w="http://schemas.openxmlformats.org/wordprocessingml/2006/main" xmlns:w14="http://schemas.microsoft.com/office/word/2010/wordml" xmlns:w15="http://schemas.microsoft.com/office/word/2012/wordml" xmlns:w16cex="http://schemas.microsoft.com/office/word/2018/wordml/cex" xmlns:w16cid="http://schemas.microsoft.com/office/word/2016/wordml/cid" xmlns:w16="http://schemas.microsoft.com/office/word/2018/wordml" xmlns:w16du="http://schemas.microsoft.com/office/word/2023/wordml/word16du" xmlns:w16sdtdh="http://schemas.microsoft.com/office/word/2020/wordml/sdtdatahash" xmlns:w16se="http://schemas.microsoft.com/office/word/2015/wordml/symex" xmlns:wpg="http://schemas.microsoft.com/office/word/2010/wordprocessingGroup" xmlns:wpi="http://schemas.microsoft.com/office/word/2010/wordprocessingInk" xmlns:wne="http://schemas.microsoft.com/office/word/2006/wordml" xmlns:wps="http://schemas.microsoft.com/office/word/2010/wordprocessingShape" mc:Ignorable="w14 w15 w16se w16cid w16 w16cex w16sdtdh w16du wp14">
   <w:p>
     <w:pPr>
       <w:pStyle w:val="Header"/>
@@ -2388,7 +2410,7 @@
 </file>
 
 <file path=word/numbering.xml><?xml version="1.0" encoding="utf-8"?>
-<w:numbering xmlns:wpc="http://schemas.microsoft.com/office/word/2010/wordprocessingCanvas" xmlns:cx="http://schemas.microsoft.com/office/drawing/2014/chartex" xmlns:cx1="http://schemas.microsoft.com/office/drawing/2015/9/8/chartex" xmlns:cx2="http://schemas.microsoft.com/office/drawing/2015/10/21/chartex" xmlns:cx3="http://schemas.microsoft.com/office/drawing/2016/5/9/chartex" xmlns:cx4="http://schemas.microsoft.com/office/drawing/2016/5/10/chartex" xmlns:cx5="http://schemas.microsoft.com/office/drawing/2016/5/11/chartex" xmlns:cx6="http://schemas.microsoft.com/office/drawing/2016/5/12/chartex" xmlns:cx7="http://schemas.microsoft.com/office/drawing/2016/5/13/chartex" xmlns:cx8="http://schemas.microsoft.com/office/drawing/2016/5/14/chartex" xmlns:mc="http://schemas.openxmlformats.org/markup-compatibility/2006" xmlns:aink="http://schemas.microsoft.com/office/drawing/2016/ink" xmlns:am3d="http://schemas.microsoft.com/office/drawing/2017/model3d" xmlns:o="urn:schemas-microsoft-com:office:office" xmlns:oel="http://schemas.microsoft.com/office/2019/extlst" xmlns:r="http://schemas.openxmlformats.org/officeDocument/2006/relationships" xmlns:m="http://schemas.openxmlformats.org/officeDocument/2006/math" xmlns:v="urn:schemas-microsoft-com:vml" xmlns:wp14="http://schemas.microsoft.com/office/word/2010/wordprocessingDrawing" xmlns:wp="http://schemas.openxmlformats.org/drawingml/2006/wordprocessingDrawing" xmlns:w10="urn:schemas-microsoft-com:office:word" xmlns:w="http://schemas.openxmlformats.org/wordprocessingml/2006/main" xmlns:w14="http://schemas.microsoft.com/office/word/2010/wordml" xmlns:w15="http://schemas.microsoft.com/office/word/2012/wordml" xmlns:w16cex="http://schemas.microsoft.com/office/word/2018/wordml/cex" xmlns:w16cid="http://schemas.microsoft.com/office/word/2016/wordml/cid" xmlns:w16="http://schemas.microsoft.com/office/word/2018/wordml" xmlns:w16sdtdh="http://schemas.microsoft.com/office/word/2020/wordml/sdtdatahash" xmlns:w16se="http://schemas.microsoft.com/office/word/2015/wordml/symex" xmlns:wpg="http://schemas.microsoft.com/office/word/2010/wordprocessingGroup" xmlns:wpi="http://schemas.microsoft.com/office/word/2010/wordprocessingInk" xmlns:wne="http://schemas.microsoft.com/office/word/2006/wordml" xmlns:wps="http://schemas.microsoft.com/office/word/2010/wordprocessingShape" mc:Ignorable="w14 w15 w16se w16cid w16 w16cex w16sdtdh wp14">
+<w:numbering xmlns:wpc="http://schemas.microsoft.com/office/word/2010/wordprocessingCanvas" xmlns:cx="http://schemas.microsoft.com/office/drawing/2014/chartex" xmlns:cx1="http://schemas.microsoft.com/office/drawing/2015/9/8/chartex" xmlns:cx2="http://schemas.microsoft.com/office/drawing/2015/10/21/chartex" xmlns:cx3="http://schemas.microsoft.com/office/drawing/2016/5/9/chartex" xmlns:cx4="http://schemas.microsoft.com/office/drawing/2016/5/10/chartex" xmlns:cx5="http://schemas.microsoft.com/office/drawing/2016/5/11/chartex" xmlns:cx6="http://schemas.microsoft.com/office/drawing/2016/5/12/chartex" xmlns:cx7="http://schemas.microsoft.com/office/drawing/2016/5/13/chartex" xmlns:cx8="http://schemas.microsoft.com/office/drawing/2016/5/14/chartex" xmlns:mc="http://schemas.openxmlformats.org/markup-compatibility/2006" xmlns:aink="http://schemas.microsoft.com/office/drawing/2016/ink" xmlns:am3d="http://schemas.microsoft.com/office/drawing/2017/model3d" xmlns:o="urn:schemas-microsoft-com:office:office" xmlns:oel="http://schemas.microsoft.com/office/2019/extlst" xmlns:r="http://schemas.openxmlformats.org/officeDocument/2006/relationships" xmlns:m="http://schemas.openxmlformats.org/officeDocument/2006/math" xmlns:v="urn:schemas-microsoft-com:vml" xmlns:wp14="http://schemas.microsoft.com/office/word/2010/wordprocessingDrawing" xmlns:wp="http://schemas.openxmlformats.org/drawingml/2006/wordprocessingDrawing" xmlns:w10="urn:schemas-microsoft-com:office:word" xmlns:w="http://schemas.openxmlformats.org/wordprocessingml/2006/main" xmlns:w14="http://schemas.microsoft.com/office/word/2010/wordml" xmlns:w15="http://schemas.microsoft.com/office/word/2012/wordml" xmlns:w16cex="http://schemas.microsoft.com/office/word/2018/wordml/cex" xmlns:w16cid="http://schemas.microsoft.com/office/word/2016/wordml/cid" xmlns:w16="http://schemas.microsoft.com/office/word/2018/wordml" xmlns:w16du="http://schemas.microsoft.com/office/word/2023/wordml/word16du" xmlns:w16sdtdh="http://schemas.microsoft.com/office/word/2020/wordml/sdtdatahash" xmlns:w16se="http://schemas.microsoft.com/office/word/2015/wordml/symex" xmlns:wpg="http://schemas.microsoft.com/office/word/2010/wordprocessingGroup" xmlns:wpi="http://schemas.microsoft.com/office/word/2010/wordprocessingInk" xmlns:wne="http://schemas.microsoft.com/office/word/2006/wordml" xmlns:wps="http://schemas.microsoft.com/office/word/2010/wordprocessingShape" mc:Ignorable="w14 w15 w16se w16cid w16 w16cex w16sdtdh w16du wp14">
   <w:abstractNum w:abstractNumId="0" w15:restartNumberingAfterBreak="0">
     <w:nsid w:val="043D512A"/>
     <w:multiLevelType w:val="hybridMultilevel"/>
@@ -4804,7 +4826,7 @@
 </file>
 
 <file path=word/styles.xml><?xml version="1.0" encoding="utf-8"?>
-<w:styles xmlns:mc="http://schemas.openxmlformats.org/markup-compatibility/2006" xmlns:r="http://schemas.openxmlformats.org/officeDocument/2006/relationships" xmlns:w="http://schemas.openxmlformats.org/wordprocessingml/2006/main" xmlns:w14="http://schemas.microsoft.com/office/word/2010/wordml" xmlns:w15="http://schemas.microsoft.com/office/word/2012/wordml" xmlns:w16cex="http://schemas.microsoft.com/office/word/2018/wordml/cex" xmlns:w16cid="http://schemas.microsoft.com/office/word/2016/wordml/cid" xmlns:w16="http://schemas.microsoft.com/office/word/2018/wordml" xmlns:w16sdtdh="http://schemas.microsoft.com/office/word/2020/wordml/sdtdatahash" xmlns:w16se="http://schemas.microsoft.com/office/word/2015/wordml/symex" mc:Ignorable="w14 w15 w16se w16cid w16 w16cex w16sdtdh">
+<w:styles xmlns:mc="http://schemas.openxmlformats.org/markup-compatibility/2006" xmlns:r="http://schemas.openxmlformats.org/officeDocument/2006/relationships" xmlns:w="http://schemas.openxmlformats.org/wordprocessingml/2006/main" xmlns:w14="http://schemas.microsoft.com/office/word/2010/wordml" xmlns:w15="http://schemas.microsoft.com/office/word/2012/wordml" xmlns:w16cex="http://schemas.microsoft.com/office/word/2018/wordml/cex" xmlns:w16cid="http://schemas.microsoft.com/office/word/2016/wordml/cid" xmlns:w16="http://schemas.microsoft.com/office/word/2018/wordml" xmlns:w16du="http://schemas.microsoft.com/office/word/2023/wordml/word16du" xmlns:w16sdtdh="http://schemas.microsoft.com/office/word/2020/wordml/sdtdatahash" xmlns:w16se="http://schemas.microsoft.com/office/word/2015/wordml/symex" mc:Ignorable="w14 w15 w16se w16cid w16 w16cex w16sdtdh w16du">
   <w:docDefaults>
     <w:rPrDefault>
       <w:rPr>
@@ -5326,6 +5348,7 @@
   <w:style w:type="character" w:default="1" w:styleId="DefaultParagraphFont">
     <w:name w:val="Default Paragraph Font"/>
     <w:uiPriority w:val="1"/>
+    <w:semiHidden/>
     <w:unhideWhenUsed/>
   </w:style>
   <w:style w:type="table" w:default="1" w:styleId="TableNormal">

</xml_diff>